<commit_message>
Add tech-time-entry-audit pipeline + BWH 2026 annual review
- BWH 2026 review under clients/bwh/2026/ (life-of-contract data, savings analysis,
  branded Word + Excel reports, 18 MB of pulled portal data)
- New technijian/tech-training/ folder with reusable audit pipeline:
  - Per-client outlier flagging across 40 clients (124 flagged entries / 236 hrs)
  - Per-tech personalized training docs with coaching examples
  - Cross-client by-tech aggregation
- Microsoft Graph integration:
  - Email signature extraction from RJain Sent Items
  - Tech name resolver with directory-cache (tech-emails.json)
  - Outlook draft creation + send (13 training emails sent 2026-04-25)
- _secrets.py loads M365 creds from env vars or local key vault — no secrets
  baked into source. .gitignore added for __pycache__ and raw HTML samples.
</commit_message>
<xml_diff>
--- a/technijian/tech-training/2026/by-tech/A-Bhardwaj/A-Bhardwaj-Training.docx
+++ b/technijian/tech-training/2026/by-tech/A-Bhardwaj/A-Bhardwaj-Training.docx
@@ -4454,6 +4454,2148 @@
                 <w:color w:val="F67D4B"/>
                 <w:sz w:val="28"/>
               </w:rPr>
+              <w:t xml:space="preserve">  Coaching — what your titles should look like</w:t>
+            </w:r>
+          </w:p>
+        </w:tc>
+      </w:tr>
+    </w:tbl>
+    <w:p/>
+    <w:p>
+      <w:pPr>
+        <w:spacing w:after="160"/>
+      </w:pPr>
+      <w:r>
+        <w:rPr>
+          <w:rFonts w:ascii="Open Sans" w:hAnsi="Open Sans"/>
+          <w:b w:val="0"/>
+          <w:i w:val="0"/>
+          <w:color w:val="1A1A2E"/>
+          <w:sz w:val="22"/>
+        </w:rPr>
+        <w:t>For each of your top flagged entries below, you'll see what you wrote, the expected normal time for that work, what the title should have included, and two model rewrites: one that fits within the cap and one that justifies the higher hours you actually logged.</w:t>
+      </w:r>
+    </w:p>
+    <w:p/>
+    <w:p>
+      <w:pPr>
+        <w:spacing w:before="200" w:after="80"/>
+      </w:pPr>
+      <w:r>
+        <w:rPr>
+          <w:rFonts w:ascii="Open Sans" w:hAnsi="Open Sans"/>
+          <w:b/>
+          <w:i w:val="0"/>
+          <w:color w:val="006DB6"/>
+          <w:sz w:val="24"/>
+        </w:rPr>
+        <w:t>ORX ORX  —  2.50h logged</w:t>
+      </w:r>
+    </w:p>
+    <w:p>
+      <w:pPr>
+        <w:spacing w:after="80"/>
+      </w:pPr>
+      <w:r>
+        <w:rPr>
+          <w:rFonts w:ascii="Open Sans" w:hAnsi="Open Sans"/>
+          <w:b/>
+          <w:i w:val="0"/>
+          <w:color w:val="1A1A2E"/>
+          <w:sz w:val="20"/>
+        </w:rPr>
+        <w:t xml:space="preserve">You wrote:  </w:t>
+      </w:r>
+      <w:r>
+        <w:rPr>
+          <w:rFonts w:ascii="Open Sans" w:hAnsi="Open Sans"/>
+          <w:b w:val="0"/>
+          <w:i/>
+          <w:color w:val="59595B"/>
+          <w:sz w:val="20"/>
+        </w:rPr>
+        <w:t>“TRYING TO OBTAIN VOICEMAIL FROM PHONE”</w:t>
+      </w:r>
+    </w:p>
+    <w:p>
+      <w:pPr>
+        <w:spacing w:after="80"/>
+      </w:pPr>
+      <w:r>
+        <w:rPr>
+          <w:rFonts w:ascii="Open Sans" w:hAnsi="Open Sans"/>
+          <w:b/>
+          <w:i w:val="0"/>
+          <w:color w:val="1A1A2E"/>
+          <w:sz w:val="20"/>
+        </w:rPr>
+        <w:t xml:space="preserve">Category: </w:t>
+      </w:r>
+      <w:r>
+        <w:rPr>
+          <w:rFonts w:ascii="Open Sans" w:hAnsi="Open Sans"/>
+          <w:b w:val="0"/>
+          <w:i w:val="0"/>
+          <w:color w:val="59595B"/>
+          <w:sz w:val="20"/>
+        </w:rPr>
+        <w:t xml:space="preserve">Routine: Phone / Voice / Teams   </w:t>
+      </w:r>
+      <w:r>
+        <w:rPr>
+          <w:rFonts w:ascii="Open Sans" w:hAnsi="Open Sans"/>
+          <w:b/>
+          <w:i w:val="0"/>
+          <w:color w:val="1A1A2E"/>
+          <w:sz w:val="20"/>
+        </w:rPr>
+        <w:t xml:space="preserve">Expected: </w:t>
+      </w:r>
+      <w:r>
+        <w:rPr>
+          <w:rFonts w:ascii="Open Sans" w:hAnsi="Open Sans"/>
+          <w:b w:val="0"/>
+          <w:i w:val="0"/>
+          <w:color w:val="59595B"/>
+          <w:sz w:val="20"/>
+        </w:rPr>
+        <w:t>≤ 1.5 hours</w:t>
+      </w:r>
+    </w:p>
+    <w:p>
+      <w:pPr>
+        <w:spacing w:after="80"/>
+      </w:pPr>
+      <w:r>
+        <w:rPr>
+          <w:rFonts w:ascii="Open Sans" w:hAnsi="Open Sans"/>
+          <w:b/>
+          <w:i w:val="0"/>
+          <w:color w:val="1A1A2E"/>
+          <w:sz w:val="20"/>
+        </w:rPr>
+        <w:t xml:space="preserve">Why flagged: </w:t>
+      </w:r>
+      <w:r>
+        <w:rPr>
+          <w:rFonts w:ascii="Open Sans" w:hAnsi="Open Sans"/>
+          <w:b w:val="0"/>
+          <w:i w:val="0"/>
+          <w:color w:val="F67D4B"/>
+          <w:sz w:val="20"/>
+        </w:rPr>
+        <w:t>Your 2.50h is well above the 1.5h normal — title MUST justify the extra time.</w:t>
+      </w:r>
+    </w:p>
+    <w:p>
+      <w:pPr>
+        <w:spacing w:after="80"/>
+      </w:pPr>
+      <w:r>
+        <w:rPr>
+          <w:rFonts w:ascii="Open Sans" w:hAnsi="Open Sans"/>
+          <w:b/>
+          <w:i w:val="0"/>
+          <w:color w:val="1A1A2E"/>
+          <w:sz w:val="20"/>
+        </w:rPr>
+        <w:t xml:space="preserve">Title must include: </w:t>
+      </w:r>
+      <w:r>
+        <w:rPr>
+          <w:rFonts w:ascii="Open Sans" w:hAnsi="Open Sans"/>
+          <w:b w:val="0"/>
+          <w:i w:val="0"/>
+          <w:color w:val="59595B"/>
+          <w:sz w:val="20"/>
+        </w:rPr>
+        <w:t>platform (RingCentral / Teams / 3CX), action (extension move, DID provision, license)</w:t>
+      </w:r>
+    </w:p>
+    <w:tbl>
+      <w:tblPr>
+        <w:tblW w:type="auto" w:w="0"/>
+        <w:tblLayout w:type="fixed"/>
+        <w:tblLook w:firstColumn="1" w:firstRow="1" w:lastColumn="0" w:lastRow="0" w:noHBand="0" w:noVBand="1" w:val="04A0"/>
+      </w:tblPr>
+      <w:tblGrid>
+        <w:gridCol w:w="4680"/>
+        <w:gridCol w:w="4680"/>
+      </w:tblGrid>
+      <w:tr>
+        <w:tc>
+          <w:tcPr>
+            <w:tcW w:type="dxa" w:w="2880"/>
+            <w:shd w:val="clear" w:color="auto" w:fill="F8F9FA"/>
+            <w:tcBorders>
+              <w:top w:val="single" w:sz="4" w:color="E9ECEF"/>
+              <w:left w:val="single" w:sz="4" w:color="E9ECEF"/>
+              <w:bottom w:val="single" w:sz="4" w:color="E9ECEF"/>
+              <w:right w:val="single" w:sz="4" w:color="E9ECEF"/>
+            </w:tcBorders>
+          </w:tcPr>
+          <w:p>
+            <w:pPr>
+              <w:spacing w:before="60" w:after="60"/>
+            </w:pPr>
+            <w:r>
+              <w:rPr>
+                <w:rFonts w:ascii="Open Sans" w:hAnsi="Open Sans"/>
+                <w:b/>
+                <w:i w:val="0"/>
+                <w:color w:val="1EAAC8"/>
+                <w:sz w:val="19"/>
+              </w:rPr>
+              <w:t>Model title within 1.5h</w:t>
+            </w:r>
+          </w:p>
+        </w:tc>
+        <w:tc>
+          <w:tcPr>
+            <w:tcW w:type="dxa" w:w="6480"/>
+            <w:shd w:val="clear" w:color="auto" w:fill="FFFFFF"/>
+            <w:tcBorders>
+              <w:top w:val="single" w:sz="4" w:color="E9ECEF"/>
+              <w:left w:val="single" w:sz="4" w:color="E9ECEF"/>
+              <w:bottom w:val="single" w:sz="4" w:color="E9ECEF"/>
+              <w:right w:val="single" w:sz="4" w:color="E9ECEF"/>
+            </w:tcBorders>
+          </w:tcPr>
+          <w:p>
+            <w:pPr>
+              <w:spacing w:before="60" w:after="60"/>
+            </w:pPr>
+            <w:r>
+              <w:rPr>
+                <w:rFonts w:ascii="Open Sans" w:hAnsi="Open Sans"/>
+                <w:b w:val="0"/>
+                <w:i w:val="0"/>
+                <w:color w:val="1A1A2E"/>
+                <w:sz w:val="19"/>
+              </w:rPr>
+              <w:t>RingCentral extension move for new hire, voicemail verified</w:t>
+            </w:r>
+          </w:p>
+        </w:tc>
+      </w:tr>
+      <w:tr>
+        <w:tc>
+          <w:tcPr>
+            <w:tcW w:type="dxa" w:w="2880"/>
+            <w:shd w:val="clear" w:color="auto" w:fill="F8F9FA"/>
+            <w:tcBorders>
+              <w:top w:val="single" w:sz="4" w:color="E9ECEF"/>
+              <w:left w:val="single" w:sz="4" w:color="E9ECEF"/>
+              <w:bottom w:val="single" w:sz="4" w:color="E9ECEF"/>
+              <w:right w:val="single" w:sz="4" w:color="E9ECEF"/>
+            </w:tcBorders>
+          </w:tcPr>
+          <w:p>
+            <w:pPr>
+              <w:spacing w:before="60" w:after="60"/>
+            </w:pPr>
+            <w:r>
+              <w:rPr>
+                <w:rFonts w:ascii="Open Sans" w:hAnsi="Open Sans"/>
+                <w:b/>
+                <w:i w:val="0"/>
+                <w:color w:val="F67D4B"/>
+                <w:sz w:val="19"/>
+              </w:rPr>
+              <w:t>Model title to justify 2.50h</w:t>
+            </w:r>
+          </w:p>
+        </w:tc>
+        <w:tc>
+          <w:tcPr>
+            <w:tcW w:type="dxa" w:w="6480"/>
+            <w:shd w:val="clear" w:color="auto" w:fill="FFFFFF"/>
+            <w:tcBorders>
+              <w:top w:val="single" w:sz="4" w:color="E9ECEF"/>
+              <w:left w:val="single" w:sz="4" w:color="E9ECEF"/>
+              <w:bottom w:val="single" w:sz="4" w:color="E9ECEF"/>
+              <w:right w:val="single" w:sz="4" w:color="E9ECEF"/>
+            </w:tcBorders>
+          </w:tcPr>
+          <w:p>
+            <w:pPr>
+              <w:spacing w:before="60" w:after="60"/>
+            </w:pPr>
+            <w:r>
+              <w:rPr>
+                <w:rFonts w:ascii="Open Sans" w:hAnsi="Open Sans"/>
+                <w:b w:val="0"/>
+                <w:i w:val="0"/>
+                <w:color w:val="1A1A2E"/>
+                <w:sz w:val="19"/>
+              </w:rPr>
+              <w:t>RingCentral migration for 3 users — re-provisioned extensions, ported DIDs, configured call queue, end-user training session (~3h)</w:t>
+            </w:r>
+          </w:p>
+        </w:tc>
+      </w:tr>
+    </w:tbl>
+    <w:p>
+      <w:pPr>
+        <w:spacing w:before="200" w:after="80"/>
+      </w:pPr>
+      <w:r>
+        <w:rPr>
+          <w:rFonts w:ascii="Open Sans" w:hAnsi="Open Sans"/>
+          <w:b/>
+          <w:i w:val="0"/>
+          <w:color w:val="006DB6"/>
+          <w:sz w:val="24"/>
+        </w:rPr>
+        <w:t>BST BST  —  2.25h logged</w:t>
+      </w:r>
+    </w:p>
+    <w:p>
+      <w:pPr>
+        <w:spacing w:after="80"/>
+      </w:pPr>
+      <w:r>
+        <w:rPr>
+          <w:rFonts w:ascii="Open Sans" w:hAnsi="Open Sans"/>
+          <w:b/>
+          <w:i w:val="0"/>
+          <w:color w:val="1A1A2E"/>
+          <w:sz w:val="20"/>
+        </w:rPr>
+        <w:t xml:space="preserve">You wrote:  </w:t>
+      </w:r>
+      <w:r>
+        <w:rPr>
+          <w:rFonts w:ascii="Open Sans" w:hAnsi="Open Sans"/>
+          <w:b w:val="0"/>
+          <w:i/>
+          <w:color w:val="59595B"/>
+          <w:sz w:val="20"/>
+        </w:rPr>
+        <w:t>“Device Non-Compliant Due to Missing Patches- BST-HQ-AD-01, BST-HQ-AD-02, BST-HQ-FS-01, BST-HQ-FS-02, BST-HQ-VBR-01.”</w:t>
+      </w:r>
+    </w:p>
+    <w:p>
+      <w:pPr>
+        <w:spacing w:after="80"/>
+      </w:pPr>
+      <w:r>
+        <w:rPr>
+          <w:rFonts w:ascii="Open Sans" w:hAnsi="Open Sans"/>
+          <w:b/>
+          <w:i w:val="0"/>
+          <w:color w:val="1A1A2E"/>
+          <w:sz w:val="20"/>
+        </w:rPr>
+        <w:t xml:space="preserve">Category: </w:t>
+      </w:r>
+      <w:r>
+        <w:rPr>
+          <w:rFonts w:ascii="Open Sans" w:hAnsi="Open Sans"/>
+          <w:b w:val="0"/>
+          <w:i w:val="0"/>
+          <w:color w:val="59595B"/>
+          <w:sz w:val="20"/>
+        </w:rPr>
+        <w:t xml:space="preserve">Routine: Patch management / Windows Update   </w:t>
+      </w:r>
+      <w:r>
+        <w:rPr>
+          <w:rFonts w:ascii="Open Sans" w:hAnsi="Open Sans"/>
+          <w:b/>
+          <w:i w:val="0"/>
+          <w:color w:val="1A1A2E"/>
+          <w:sz w:val="20"/>
+        </w:rPr>
+        <w:t xml:space="preserve">Expected: </w:t>
+      </w:r>
+      <w:r>
+        <w:rPr>
+          <w:rFonts w:ascii="Open Sans" w:hAnsi="Open Sans"/>
+          <w:b w:val="0"/>
+          <w:i w:val="0"/>
+          <w:color w:val="59595B"/>
+          <w:sz w:val="20"/>
+        </w:rPr>
+        <w:t>≤ 1.5 hours</w:t>
+      </w:r>
+    </w:p>
+    <w:p>
+      <w:pPr>
+        <w:spacing w:after="80"/>
+      </w:pPr>
+      <w:r>
+        <w:rPr>
+          <w:rFonts w:ascii="Open Sans" w:hAnsi="Open Sans"/>
+          <w:b/>
+          <w:i w:val="0"/>
+          <w:color w:val="1A1A2E"/>
+          <w:sz w:val="20"/>
+        </w:rPr>
+        <w:t xml:space="preserve">Why flagged: </w:t>
+      </w:r>
+      <w:r>
+        <w:rPr>
+          <w:rFonts w:ascii="Open Sans" w:hAnsi="Open Sans"/>
+          <w:b w:val="0"/>
+          <w:i w:val="0"/>
+          <w:color w:val="F67D4B"/>
+          <w:sz w:val="20"/>
+        </w:rPr>
+        <w:t>Your 2.25h is above the 1.5h normal cap for this category — title needs more detail.</w:t>
+      </w:r>
+    </w:p>
+    <w:p>
+      <w:pPr>
+        <w:spacing w:after="80"/>
+      </w:pPr>
+      <w:r>
+        <w:rPr>
+          <w:rFonts w:ascii="Open Sans" w:hAnsi="Open Sans"/>
+          <w:b/>
+          <w:i w:val="0"/>
+          <w:color w:val="1A1A2E"/>
+          <w:sz w:val="20"/>
+        </w:rPr>
+        <w:t xml:space="preserve">Title must include: </w:t>
+      </w:r>
+      <w:r>
+        <w:rPr>
+          <w:rFonts w:ascii="Open Sans" w:hAnsi="Open Sans"/>
+          <w:b w:val="0"/>
+          <w:i w:val="0"/>
+          <w:color w:val="59595B"/>
+          <w:sz w:val="20"/>
+        </w:rPr>
+        <w:t>machine count, which patches failed, manual reinstall steps</w:t>
+      </w:r>
+    </w:p>
+    <w:tbl>
+      <w:tblPr>
+        <w:tblW w:type="auto" w:w="0"/>
+        <w:tblLayout w:type="fixed"/>
+        <w:tblLook w:firstColumn="1" w:firstRow="1" w:lastColumn="0" w:lastRow="0" w:noHBand="0" w:noVBand="1" w:val="04A0"/>
+      </w:tblPr>
+      <w:tblGrid>
+        <w:gridCol w:w="4680"/>
+        <w:gridCol w:w="4680"/>
+      </w:tblGrid>
+      <w:tr>
+        <w:tc>
+          <w:tcPr>
+            <w:tcW w:type="dxa" w:w="2880"/>
+            <w:shd w:val="clear" w:color="auto" w:fill="F8F9FA"/>
+            <w:tcBorders>
+              <w:top w:val="single" w:sz="4" w:color="E9ECEF"/>
+              <w:left w:val="single" w:sz="4" w:color="E9ECEF"/>
+              <w:bottom w:val="single" w:sz="4" w:color="E9ECEF"/>
+              <w:right w:val="single" w:sz="4" w:color="E9ECEF"/>
+            </w:tcBorders>
+          </w:tcPr>
+          <w:p>
+            <w:pPr>
+              <w:spacing w:before="60" w:after="60"/>
+            </w:pPr>
+            <w:r>
+              <w:rPr>
+                <w:rFonts w:ascii="Open Sans" w:hAnsi="Open Sans"/>
+                <w:b/>
+                <w:i w:val="0"/>
+                <w:color w:val="1EAAC8"/>
+                <w:sz w:val="19"/>
+              </w:rPr>
+              <w:t>Model title within 1.5h</w:t>
+            </w:r>
+          </w:p>
+        </w:tc>
+        <w:tc>
+          <w:tcPr>
+            <w:tcW w:type="dxa" w:w="6480"/>
+            <w:shd w:val="clear" w:color="auto" w:fill="FFFFFF"/>
+            <w:tcBorders>
+              <w:top w:val="single" w:sz="4" w:color="E9ECEF"/>
+              <w:left w:val="single" w:sz="4" w:color="E9ECEF"/>
+              <w:bottom w:val="single" w:sz="4" w:color="E9ECEF"/>
+              <w:right w:val="single" w:sz="4" w:color="E9ECEF"/>
+            </w:tcBorders>
+          </w:tcPr>
+          <w:p>
+            <w:pPr>
+              <w:spacing w:before="60" w:after="60"/>
+            </w:pPr>
+            <w:r>
+              <w:rPr>
+                <w:rFonts w:ascii="Open Sans" w:hAnsi="Open Sans"/>
+                <w:b w:val="0"/>
+                <w:i w:val="0"/>
+                <w:color w:val="1A1A2E"/>
+                <w:sz w:val="19"/>
+              </w:rPr>
+              <w:t>Monthly patch run — 28 endpoints all green, no manual intervention needed</w:t>
+            </w:r>
+          </w:p>
+        </w:tc>
+      </w:tr>
+      <w:tr>
+        <w:tc>
+          <w:tcPr>
+            <w:tcW w:type="dxa" w:w="2880"/>
+            <w:shd w:val="clear" w:color="auto" w:fill="F8F9FA"/>
+            <w:tcBorders>
+              <w:top w:val="single" w:sz="4" w:color="E9ECEF"/>
+              <w:left w:val="single" w:sz="4" w:color="E9ECEF"/>
+              <w:bottom w:val="single" w:sz="4" w:color="E9ECEF"/>
+              <w:right w:val="single" w:sz="4" w:color="E9ECEF"/>
+            </w:tcBorders>
+          </w:tcPr>
+          <w:p>
+            <w:pPr>
+              <w:spacing w:before="60" w:after="60"/>
+            </w:pPr>
+            <w:r>
+              <w:rPr>
+                <w:rFonts w:ascii="Open Sans" w:hAnsi="Open Sans"/>
+                <w:b/>
+                <w:i w:val="0"/>
+                <w:color w:val="F67D4B"/>
+                <w:sz w:val="19"/>
+              </w:rPr>
+              <w:t>Model title to justify 2.25h</w:t>
+            </w:r>
+          </w:p>
+        </w:tc>
+        <w:tc>
+          <w:tcPr>
+            <w:tcW w:type="dxa" w:w="6480"/>
+            <w:shd w:val="clear" w:color="auto" w:fill="FFFFFF"/>
+            <w:tcBorders>
+              <w:top w:val="single" w:sz="4" w:color="E9ECEF"/>
+              <w:left w:val="single" w:sz="4" w:color="E9ECEF"/>
+              <w:bottom w:val="single" w:sz="4" w:color="E9ECEF"/>
+              <w:right w:val="single" w:sz="4" w:color="E9ECEF"/>
+            </w:tcBorders>
+          </w:tcPr>
+          <w:p>
+            <w:pPr>
+              <w:spacing w:before="60" w:after="60"/>
+            </w:pPr>
+            <w:r>
+              <w:rPr>
+                <w:rFonts w:ascii="Open Sans" w:hAnsi="Open Sans"/>
+                <w:b w:val="0"/>
+                <w:i w:val="0"/>
+                <w:color w:val="1A1A2E"/>
+                <w:sz w:val="19"/>
+              </w:rPr>
+              <w:t>Patched 42 machines — 6 required manual WU service restart and reinstall of KB5034441; verified compliance in N-able dashboard before close (~2.5h)</w:t>
+            </w:r>
+          </w:p>
+        </w:tc>
+      </w:tr>
+    </w:tbl>
+    <w:p>
+      <w:pPr>
+        <w:spacing w:before="200" w:after="80"/>
+      </w:pPr>
+      <w:r>
+        <w:rPr>
+          <w:rFonts w:ascii="Open Sans" w:hAnsi="Open Sans"/>
+          <w:b/>
+          <w:i w:val="0"/>
+          <w:color w:val="006DB6"/>
+          <w:sz w:val="24"/>
+        </w:rPr>
+        <w:t>ANI ANI  —  2.25h logged</w:t>
+      </w:r>
+    </w:p>
+    <w:p>
+      <w:pPr>
+        <w:spacing w:after="80"/>
+      </w:pPr>
+      <w:r>
+        <w:rPr>
+          <w:rFonts w:ascii="Open Sans" w:hAnsi="Open Sans"/>
+          <w:b/>
+          <w:i w:val="0"/>
+          <w:color w:val="1A1A2E"/>
+          <w:sz w:val="20"/>
+        </w:rPr>
+        <w:t xml:space="preserve">You wrote:  </w:t>
+      </w:r>
+      <w:r>
+        <w:rPr>
+          <w:rFonts w:ascii="Open Sans" w:hAnsi="Open Sans"/>
+          <w:b w:val="0"/>
+          <w:i/>
+          <w:color w:val="59595B"/>
+          <w:sz w:val="20"/>
+        </w:rPr>
+        <w:t>“Device Non-Compliant Due to Missing Patches-  ANI-HQ-OPSPRB-01, ANI-HQ-VBR-02, ANI-HQ-VONE, VMANIDC02, VMANIFS-01, VMANI”</w:t>
+      </w:r>
+    </w:p>
+    <w:p>
+      <w:pPr>
+        <w:spacing w:after="80"/>
+      </w:pPr>
+      <w:r>
+        <w:rPr>
+          <w:rFonts w:ascii="Open Sans" w:hAnsi="Open Sans"/>
+          <w:b/>
+          <w:i w:val="0"/>
+          <w:color w:val="1A1A2E"/>
+          <w:sz w:val="20"/>
+        </w:rPr>
+        <w:t xml:space="preserve">Category: </w:t>
+      </w:r>
+      <w:r>
+        <w:rPr>
+          <w:rFonts w:ascii="Open Sans" w:hAnsi="Open Sans"/>
+          <w:b w:val="0"/>
+          <w:i w:val="0"/>
+          <w:color w:val="59595B"/>
+          <w:sz w:val="20"/>
+        </w:rPr>
+        <w:t xml:space="preserve">Routine: Patch management / Windows Update   </w:t>
+      </w:r>
+      <w:r>
+        <w:rPr>
+          <w:rFonts w:ascii="Open Sans" w:hAnsi="Open Sans"/>
+          <w:b/>
+          <w:i w:val="0"/>
+          <w:color w:val="1A1A2E"/>
+          <w:sz w:val="20"/>
+        </w:rPr>
+        <w:t xml:space="preserve">Expected: </w:t>
+      </w:r>
+      <w:r>
+        <w:rPr>
+          <w:rFonts w:ascii="Open Sans" w:hAnsi="Open Sans"/>
+          <w:b w:val="0"/>
+          <w:i w:val="0"/>
+          <w:color w:val="59595B"/>
+          <w:sz w:val="20"/>
+        </w:rPr>
+        <w:t>≤ 1.5 hours</w:t>
+      </w:r>
+    </w:p>
+    <w:p>
+      <w:pPr>
+        <w:spacing w:after="80"/>
+      </w:pPr>
+      <w:r>
+        <w:rPr>
+          <w:rFonts w:ascii="Open Sans" w:hAnsi="Open Sans"/>
+          <w:b/>
+          <w:i w:val="0"/>
+          <w:color w:val="1A1A2E"/>
+          <w:sz w:val="20"/>
+        </w:rPr>
+        <w:t xml:space="preserve">Why flagged: </w:t>
+      </w:r>
+      <w:r>
+        <w:rPr>
+          <w:rFonts w:ascii="Open Sans" w:hAnsi="Open Sans"/>
+          <w:b w:val="0"/>
+          <w:i w:val="0"/>
+          <w:color w:val="F67D4B"/>
+          <w:sz w:val="20"/>
+        </w:rPr>
+        <w:t>Your 2.25h is above the 1.5h normal cap for this category — title needs more detail.</w:t>
+      </w:r>
+    </w:p>
+    <w:p>
+      <w:pPr>
+        <w:spacing w:after="80"/>
+      </w:pPr>
+      <w:r>
+        <w:rPr>
+          <w:rFonts w:ascii="Open Sans" w:hAnsi="Open Sans"/>
+          <w:b/>
+          <w:i w:val="0"/>
+          <w:color w:val="1A1A2E"/>
+          <w:sz w:val="20"/>
+        </w:rPr>
+        <w:t xml:space="preserve">Title must include: </w:t>
+      </w:r>
+      <w:r>
+        <w:rPr>
+          <w:rFonts w:ascii="Open Sans" w:hAnsi="Open Sans"/>
+          <w:b w:val="0"/>
+          <w:i w:val="0"/>
+          <w:color w:val="59595B"/>
+          <w:sz w:val="20"/>
+        </w:rPr>
+        <w:t>machine count, which patches failed, manual reinstall steps</w:t>
+      </w:r>
+    </w:p>
+    <w:tbl>
+      <w:tblPr>
+        <w:tblW w:type="auto" w:w="0"/>
+        <w:tblLayout w:type="fixed"/>
+        <w:tblLook w:firstColumn="1" w:firstRow="1" w:lastColumn="0" w:lastRow="0" w:noHBand="0" w:noVBand="1" w:val="04A0"/>
+      </w:tblPr>
+      <w:tblGrid>
+        <w:gridCol w:w="4680"/>
+        <w:gridCol w:w="4680"/>
+      </w:tblGrid>
+      <w:tr>
+        <w:tc>
+          <w:tcPr>
+            <w:tcW w:type="dxa" w:w="2880"/>
+            <w:shd w:val="clear" w:color="auto" w:fill="F8F9FA"/>
+            <w:tcBorders>
+              <w:top w:val="single" w:sz="4" w:color="E9ECEF"/>
+              <w:left w:val="single" w:sz="4" w:color="E9ECEF"/>
+              <w:bottom w:val="single" w:sz="4" w:color="E9ECEF"/>
+              <w:right w:val="single" w:sz="4" w:color="E9ECEF"/>
+            </w:tcBorders>
+          </w:tcPr>
+          <w:p>
+            <w:pPr>
+              <w:spacing w:before="60" w:after="60"/>
+            </w:pPr>
+            <w:r>
+              <w:rPr>
+                <w:rFonts w:ascii="Open Sans" w:hAnsi="Open Sans"/>
+                <w:b/>
+                <w:i w:val="0"/>
+                <w:color w:val="1EAAC8"/>
+                <w:sz w:val="19"/>
+              </w:rPr>
+              <w:t>Model title within 1.5h</w:t>
+            </w:r>
+          </w:p>
+        </w:tc>
+        <w:tc>
+          <w:tcPr>
+            <w:tcW w:type="dxa" w:w="6480"/>
+            <w:shd w:val="clear" w:color="auto" w:fill="FFFFFF"/>
+            <w:tcBorders>
+              <w:top w:val="single" w:sz="4" w:color="E9ECEF"/>
+              <w:left w:val="single" w:sz="4" w:color="E9ECEF"/>
+              <w:bottom w:val="single" w:sz="4" w:color="E9ECEF"/>
+              <w:right w:val="single" w:sz="4" w:color="E9ECEF"/>
+            </w:tcBorders>
+          </w:tcPr>
+          <w:p>
+            <w:pPr>
+              <w:spacing w:before="60" w:after="60"/>
+            </w:pPr>
+            <w:r>
+              <w:rPr>
+                <w:rFonts w:ascii="Open Sans" w:hAnsi="Open Sans"/>
+                <w:b w:val="0"/>
+                <w:i w:val="0"/>
+                <w:color w:val="1A1A2E"/>
+                <w:sz w:val="19"/>
+              </w:rPr>
+              <w:t>Monthly patch run — 28 endpoints all green, no manual intervention needed</w:t>
+            </w:r>
+          </w:p>
+        </w:tc>
+      </w:tr>
+      <w:tr>
+        <w:tc>
+          <w:tcPr>
+            <w:tcW w:type="dxa" w:w="2880"/>
+            <w:shd w:val="clear" w:color="auto" w:fill="F8F9FA"/>
+            <w:tcBorders>
+              <w:top w:val="single" w:sz="4" w:color="E9ECEF"/>
+              <w:left w:val="single" w:sz="4" w:color="E9ECEF"/>
+              <w:bottom w:val="single" w:sz="4" w:color="E9ECEF"/>
+              <w:right w:val="single" w:sz="4" w:color="E9ECEF"/>
+            </w:tcBorders>
+          </w:tcPr>
+          <w:p>
+            <w:pPr>
+              <w:spacing w:before="60" w:after="60"/>
+            </w:pPr>
+            <w:r>
+              <w:rPr>
+                <w:rFonts w:ascii="Open Sans" w:hAnsi="Open Sans"/>
+                <w:b/>
+                <w:i w:val="0"/>
+                <w:color w:val="F67D4B"/>
+                <w:sz w:val="19"/>
+              </w:rPr>
+              <w:t>Model title to justify 2.25h</w:t>
+            </w:r>
+          </w:p>
+        </w:tc>
+        <w:tc>
+          <w:tcPr>
+            <w:tcW w:type="dxa" w:w="6480"/>
+            <w:shd w:val="clear" w:color="auto" w:fill="FFFFFF"/>
+            <w:tcBorders>
+              <w:top w:val="single" w:sz="4" w:color="E9ECEF"/>
+              <w:left w:val="single" w:sz="4" w:color="E9ECEF"/>
+              <w:bottom w:val="single" w:sz="4" w:color="E9ECEF"/>
+              <w:right w:val="single" w:sz="4" w:color="E9ECEF"/>
+            </w:tcBorders>
+          </w:tcPr>
+          <w:p>
+            <w:pPr>
+              <w:spacing w:before="60" w:after="60"/>
+            </w:pPr>
+            <w:r>
+              <w:rPr>
+                <w:rFonts w:ascii="Open Sans" w:hAnsi="Open Sans"/>
+                <w:b w:val="0"/>
+                <w:i w:val="0"/>
+                <w:color w:val="1A1A2E"/>
+                <w:sz w:val="19"/>
+              </w:rPr>
+              <w:t>Patched 42 machines — 6 required manual WU service restart and reinstall of KB5034441; verified compliance in N-able dashboard before close (~2.5h)</w:t>
+            </w:r>
+          </w:p>
+        </w:tc>
+      </w:tr>
+    </w:tbl>
+    <w:p>
+      <w:pPr>
+        <w:spacing w:before="200" w:after="80"/>
+      </w:pPr>
+      <w:r>
+        <w:rPr>
+          <w:rFonts w:ascii="Open Sans" w:hAnsi="Open Sans"/>
+          <w:b/>
+          <w:i w:val="0"/>
+          <w:color w:val="006DB6"/>
+          <w:sz w:val="24"/>
+        </w:rPr>
+        <w:t>VAF VAF  —  2.25h logged</w:t>
+      </w:r>
+    </w:p>
+    <w:p>
+      <w:pPr>
+        <w:spacing w:after="80"/>
+      </w:pPr>
+      <w:r>
+        <w:rPr>
+          <w:rFonts w:ascii="Open Sans" w:hAnsi="Open Sans"/>
+          <w:b/>
+          <w:i w:val="0"/>
+          <w:color w:val="1A1A2E"/>
+          <w:sz w:val="20"/>
+        </w:rPr>
+        <w:t xml:space="preserve">You wrote:  </w:t>
+      </w:r>
+      <w:r>
+        <w:rPr>
+          <w:rFonts w:ascii="Open Sans" w:hAnsi="Open Sans"/>
+          <w:b w:val="0"/>
+          <w:i/>
+          <w:color w:val="59595B"/>
+          <w:sz w:val="20"/>
+        </w:rPr>
+        <w:t>“Device Non-Compliant Due to Missing Patches- VAF-DC-3CX-01, VAF-DC-AD-01, VAF-DC-FS-01, VAF-DC-FS-02.”</w:t>
+      </w:r>
+    </w:p>
+    <w:p>
+      <w:pPr>
+        <w:spacing w:after="80"/>
+      </w:pPr>
+      <w:r>
+        <w:rPr>
+          <w:rFonts w:ascii="Open Sans" w:hAnsi="Open Sans"/>
+          <w:b/>
+          <w:i w:val="0"/>
+          <w:color w:val="1A1A2E"/>
+          <w:sz w:val="20"/>
+        </w:rPr>
+        <w:t xml:space="preserve">Category: </w:t>
+      </w:r>
+      <w:r>
+        <w:rPr>
+          <w:rFonts w:ascii="Open Sans" w:hAnsi="Open Sans"/>
+          <w:b w:val="0"/>
+          <w:i w:val="0"/>
+          <w:color w:val="59595B"/>
+          <w:sz w:val="20"/>
+        </w:rPr>
+        <w:t xml:space="preserve">Routine: Patch management / Windows Update   </w:t>
+      </w:r>
+      <w:r>
+        <w:rPr>
+          <w:rFonts w:ascii="Open Sans" w:hAnsi="Open Sans"/>
+          <w:b/>
+          <w:i w:val="0"/>
+          <w:color w:val="1A1A2E"/>
+          <w:sz w:val="20"/>
+        </w:rPr>
+        <w:t xml:space="preserve">Expected: </w:t>
+      </w:r>
+      <w:r>
+        <w:rPr>
+          <w:rFonts w:ascii="Open Sans" w:hAnsi="Open Sans"/>
+          <w:b w:val="0"/>
+          <w:i w:val="0"/>
+          <w:color w:val="59595B"/>
+          <w:sz w:val="20"/>
+        </w:rPr>
+        <w:t>≤ 1.5 hours</w:t>
+      </w:r>
+    </w:p>
+    <w:p>
+      <w:pPr>
+        <w:spacing w:after="80"/>
+      </w:pPr>
+      <w:r>
+        <w:rPr>
+          <w:rFonts w:ascii="Open Sans" w:hAnsi="Open Sans"/>
+          <w:b/>
+          <w:i w:val="0"/>
+          <w:color w:val="1A1A2E"/>
+          <w:sz w:val="20"/>
+        </w:rPr>
+        <w:t xml:space="preserve">Why flagged: </w:t>
+      </w:r>
+      <w:r>
+        <w:rPr>
+          <w:rFonts w:ascii="Open Sans" w:hAnsi="Open Sans"/>
+          <w:b w:val="0"/>
+          <w:i w:val="0"/>
+          <w:color w:val="F67D4B"/>
+          <w:sz w:val="20"/>
+        </w:rPr>
+        <w:t>Your 2.25h is above the 1.5h normal cap for this category — title needs more detail.</w:t>
+      </w:r>
+    </w:p>
+    <w:p>
+      <w:pPr>
+        <w:spacing w:after="80"/>
+      </w:pPr>
+      <w:r>
+        <w:rPr>
+          <w:rFonts w:ascii="Open Sans" w:hAnsi="Open Sans"/>
+          <w:b/>
+          <w:i w:val="0"/>
+          <w:color w:val="1A1A2E"/>
+          <w:sz w:val="20"/>
+        </w:rPr>
+        <w:t xml:space="preserve">Title must include: </w:t>
+      </w:r>
+      <w:r>
+        <w:rPr>
+          <w:rFonts w:ascii="Open Sans" w:hAnsi="Open Sans"/>
+          <w:b w:val="0"/>
+          <w:i w:val="0"/>
+          <w:color w:val="59595B"/>
+          <w:sz w:val="20"/>
+        </w:rPr>
+        <w:t>machine count, which patches failed, manual reinstall steps</w:t>
+      </w:r>
+    </w:p>
+    <w:tbl>
+      <w:tblPr>
+        <w:tblW w:type="auto" w:w="0"/>
+        <w:tblLayout w:type="fixed"/>
+        <w:tblLook w:firstColumn="1" w:firstRow="1" w:lastColumn="0" w:lastRow="0" w:noHBand="0" w:noVBand="1" w:val="04A0"/>
+      </w:tblPr>
+      <w:tblGrid>
+        <w:gridCol w:w="4680"/>
+        <w:gridCol w:w="4680"/>
+      </w:tblGrid>
+      <w:tr>
+        <w:tc>
+          <w:tcPr>
+            <w:tcW w:type="dxa" w:w="2880"/>
+            <w:shd w:val="clear" w:color="auto" w:fill="F8F9FA"/>
+            <w:tcBorders>
+              <w:top w:val="single" w:sz="4" w:color="E9ECEF"/>
+              <w:left w:val="single" w:sz="4" w:color="E9ECEF"/>
+              <w:bottom w:val="single" w:sz="4" w:color="E9ECEF"/>
+              <w:right w:val="single" w:sz="4" w:color="E9ECEF"/>
+            </w:tcBorders>
+          </w:tcPr>
+          <w:p>
+            <w:pPr>
+              <w:spacing w:before="60" w:after="60"/>
+            </w:pPr>
+            <w:r>
+              <w:rPr>
+                <w:rFonts w:ascii="Open Sans" w:hAnsi="Open Sans"/>
+                <w:b/>
+                <w:i w:val="0"/>
+                <w:color w:val="1EAAC8"/>
+                <w:sz w:val="19"/>
+              </w:rPr>
+              <w:t>Model title within 1.5h</w:t>
+            </w:r>
+          </w:p>
+        </w:tc>
+        <w:tc>
+          <w:tcPr>
+            <w:tcW w:type="dxa" w:w="6480"/>
+            <w:shd w:val="clear" w:color="auto" w:fill="FFFFFF"/>
+            <w:tcBorders>
+              <w:top w:val="single" w:sz="4" w:color="E9ECEF"/>
+              <w:left w:val="single" w:sz="4" w:color="E9ECEF"/>
+              <w:bottom w:val="single" w:sz="4" w:color="E9ECEF"/>
+              <w:right w:val="single" w:sz="4" w:color="E9ECEF"/>
+            </w:tcBorders>
+          </w:tcPr>
+          <w:p>
+            <w:pPr>
+              <w:spacing w:before="60" w:after="60"/>
+            </w:pPr>
+            <w:r>
+              <w:rPr>
+                <w:rFonts w:ascii="Open Sans" w:hAnsi="Open Sans"/>
+                <w:b w:val="0"/>
+                <w:i w:val="0"/>
+                <w:color w:val="1A1A2E"/>
+                <w:sz w:val="19"/>
+              </w:rPr>
+              <w:t>Monthly patch run — 28 endpoints all green, no manual intervention needed</w:t>
+            </w:r>
+          </w:p>
+        </w:tc>
+      </w:tr>
+      <w:tr>
+        <w:tc>
+          <w:tcPr>
+            <w:tcW w:type="dxa" w:w="2880"/>
+            <w:shd w:val="clear" w:color="auto" w:fill="F8F9FA"/>
+            <w:tcBorders>
+              <w:top w:val="single" w:sz="4" w:color="E9ECEF"/>
+              <w:left w:val="single" w:sz="4" w:color="E9ECEF"/>
+              <w:bottom w:val="single" w:sz="4" w:color="E9ECEF"/>
+              <w:right w:val="single" w:sz="4" w:color="E9ECEF"/>
+            </w:tcBorders>
+          </w:tcPr>
+          <w:p>
+            <w:pPr>
+              <w:spacing w:before="60" w:after="60"/>
+            </w:pPr>
+            <w:r>
+              <w:rPr>
+                <w:rFonts w:ascii="Open Sans" w:hAnsi="Open Sans"/>
+                <w:b/>
+                <w:i w:val="0"/>
+                <w:color w:val="F67D4B"/>
+                <w:sz w:val="19"/>
+              </w:rPr>
+              <w:t>Model title to justify 2.25h</w:t>
+            </w:r>
+          </w:p>
+        </w:tc>
+        <w:tc>
+          <w:tcPr>
+            <w:tcW w:type="dxa" w:w="6480"/>
+            <w:shd w:val="clear" w:color="auto" w:fill="FFFFFF"/>
+            <w:tcBorders>
+              <w:top w:val="single" w:sz="4" w:color="E9ECEF"/>
+              <w:left w:val="single" w:sz="4" w:color="E9ECEF"/>
+              <w:bottom w:val="single" w:sz="4" w:color="E9ECEF"/>
+              <w:right w:val="single" w:sz="4" w:color="E9ECEF"/>
+            </w:tcBorders>
+          </w:tcPr>
+          <w:p>
+            <w:pPr>
+              <w:spacing w:before="60" w:after="60"/>
+            </w:pPr>
+            <w:r>
+              <w:rPr>
+                <w:rFonts w:ascii="Open Sans" w:hAnsi="Open Sans"/>
+                <w:b w:val="0"/>
+                <w:i w:val="0"/>
+                <w:color w:val="1A1A2E"/>
+                <w:sz w:val="19"/>
+              </w:rPr>
+              <w:t>Patched 42 machines — 6 required manual WU service restart and reinstall of KB5034441; verified compliance in N-able dashboard before close (~2.5h)</w:t>
+            </w:r>
+          </w:p>
+        </w:tc>
+      </w:tr>
+    </w:tbl>
+    <w:p>
+      <w:pPr>
+        <w:spacing w:before="200" w:after="80"/>
+      </w:pPr>
+      <w:r>
+        <w:rPr>
+          <w:rFonts w:ascii="Open Sans" w:hAnsi="Open Sans"/>
+          <w:b/>
+          <w:i w:val="0"/>
+          <w:color w:val="006DB6"/>
+          <w:sz w:val="24"/>
+        </w:rPr>
+        <w:t>VAF VAF  —  2.25h logged</w:t>
+      </w:r>
+    </w:p>
+    <w:p>
+      <w:pPr>
+        <w:spacing w:after="80"/>
+      </w:pPr>
+      <w:r>
+        <w:rPr>
+          <w:rFonts w:ascii="Open Sans" w:hAnsi="Open Sans"/>
+          <w:b/>
+          <w:i w:val="0"/>
+          <w:color w:val="1A1A2E"/>
+          <w:sz w:val="20"/>
+        </w:rPr>
+        <w:t xml:space="preserve">You wrote:  </w:t>
+      </w:r>
+      <w:r>
+        <w:rPr>
+          <w:rFonts w:ascii="Open Sans" w:hAnsi="Open Sans"/>
+          <w:b w:val="0"/>
+          <w:i/>
+          <w:color w:val="59595B"/>
+          <w:sz w:val="20"/>
+        </w:rPr>
+        <w:t>“Device Non-Compliant Due to Missing Patches- VAF-DC-OPSPRB, VAF-DC-SFTP-02, VAF-DC-SQL-01, VAF-DC-TS-01, VAF-DC-TSVDI-GI”</w:t>
+      </w:r>
+    </w:p>
+    <w:p>
+      <w:pPr>
+        <w:spacing w:after="80"/>
+      </w:pPr>
+      <w:r>
+        <w:rPr>
+          <w:rFonts w:ascii="Open Sans" w:hAnsi="Open Sans"/>
+          <w:b/>
+          <w:i w:val="0"/>
+          <w:color w:val="1A1A2E"/>
+          <w:sz w:val="20"/>
+        </w:rPr>
+        <w:t xml:space="preserve">Category: </w:t>
+      </w:r>
+      <w:r>
+        <w:rPr>
+          <w:rFonts w:ascii="Open Sans" w:hAnsi="Open Sans"/>
+          <w:b w:val="0"/>
+          <w:i w:val="0"/>
+          <w:color w:val="59595B"/>
+          <w:sz w:val="20"/>
+        </w:rPr>
+        <w:t xml:space="preserve">Routine: Patch management / Windows Update   </w:t>
+      </w:r>
+      <w:r>
+        <w:rPr>
+          <w:rFonts w:ascii="Open Sans" w:hAnsi="Open Sans"/>
+          <w:b/>
+          <w:i w:val="0"/>
+          <w:color w:val="1A1A2E"/>
+          <w:sz w:val="20"/>
+        </w:rPr>
+        <w:t xml:space="preserve">Expected: </w:t>
+      </w:r>
+      <w:r>
+        <w:rPr>
+          <w:rFonts w:ascii="Open Sans" w:hAnsi="Open Sans"/>
+          <w:b w:val="0"/>
+          <w:i w:val="0"/>
+          <w:color w:val="59595B"/>
+          <w:sz w:val="20"/>
+        </w:rPr>
+        <w:t>≤ 1.5 hours</w:t>
+      </w:r>
+    </w:p>
+    <w:p>
+      <w:pPr>
+        <w:spacing w:after="80"/>
+      </w:pPr>
+      <w:r>
+        <w:rPr>
+          <w:rFonts w:ascii="Open Sans" w:hAnsi="Open Sans"/>
+          <w:b/>
+          <w:i w:val="0"/>
+          <w:color w:val="1A1A2E"/>
+          <w:sz w:val="20"/>
+        </w:rPr>
+        <w:t xml:space="preserve">Why flagged: </w:t>
+      </w:r>
+      <w:r>
+        <w:rPr>
+          <w:rFonts w:ascii="Open Sans" w:hAnsi="Open Sans"/>
+          <w:b w:val="0"/>
+          <w:i w:val="0"/>
+          <w:color w:val="F67D4B"/>
+          <w:sz w:val="20"/>
+        </w:rPr>
+        <w:t>Your 2.25h is above the 1.5h normal cap for this category — title needs more detail.</w:t>
+      </w:r>
+    </w:p>
+    <w:p>
+      <w:pPr>
+        <w:spacing w:after="80"/>
+      </w:pPr>
+      <w:r>
+        <w:rPr>
+          <w:rFonts w:ascii="Open Sans" w:hAnsi="Open Sans"/>
+          <w:b/>
+          <w:i w:val="0"/>
+          <w:color w:val="1A1A2E"/>
+          <w:sz w:val="20"/>
+        </w:rPr>
+        <w:t xml:space="preserve">Title must include: </w:t>
+      </w:r>
+      <w:r>
+        <w:rPr>
+          <w:rFonts w:ascii="Open Sans" w:hAnsi="Open Sans"/>
+          <w:b w:val="0"/>
+          <w:i w:val="0"/>
+          <w:color w:val="59595B"/>
+          <w:sz w:val="20"/>
+        </w:rPr>
+        <w:t>machine count, which patches failed, manual reinstall steps</w:t>
+      </w:r>
+    </w:p>
+    <w:tbl>
+      <w:tblPr>
+        <w:tblW w:type="auto" w:w="0"/>
+        <w:tblLayout w:type="fixed"/>
+        <w:tblLook w:firstColumn="1" w:firstRow="1" w:lastColumn="0" w:lastRow="0" w:noHBand="0" w:noVBand="1" w:val="04A0"/>
+      </w:tblPr>
+      <w:tblGrid>
+        <w:gridCol w:w="4680"/>
+        <w:gridCol w:w="4680"/>
+      </w:tblGrid>
+      <w:tr>
+        <w:tc>
+          <w:tcPr>
+            <w:tcW w:type="dxa" w:w="2880"/>
+            <w:shd w:val="clear" w:color="auto" w:fill="F8F9FA"/>
+            <w:tcBorders>
+              <w:top w:val="single" w:sz="4" w:color="E9ECEF"/>
+              <w:left w:val="single" w:sz="4" w:color="E9ECEF"/>
+              <w:bottom w:val="single" w:sz="4" w:color="E9ECEF"/>
+              <w:right w:val="single" w:sz="4" w:color="E9ECEF"/>
+            </w:tcBorders>
+          </w:tcPr>
+          <w:p>
+            <w:pPr>
+              <w:spacing w:before="60" w:after="60"/>
+            </w:pPr>
+            <w:r>
+              <w:rPr>
+                <w:rFonts w:ascii="Open Sans" w:hAnsi="Open Sans"/>
+                <w:b/>
+                <w:i w:val="0"/>
+                <w:color w:val="1EAAC8"/>
+                <w:sz w:val="19"/>
+              </w:rPr>
+              <w:t>Model title within 1.5h</w:t>
+            </w:r>
+          </w:p>
+        </w:tc>
+        <w:tc>
+          <w:tcPr>
+            <w:tcW w:type="dxa" w:w="6480"/>
+            <w:shd w:val="clear" w:color="auto" w:fill="FFFFFF"/>
+            <w:tcBorders>
+              <w:top w:val="single" w:sz="4" w:color="E9ECEF"/>
+              <w:left w:val="single" w:sz="4" w:color="E9ECEF"/>
+              <w:bottom w:val="single" w:sz="4" w:color="E9ECEF"/>
+              <w:right w:val="single" w:sz="4" w:color="E9ECEF"/>
+            </w:tcBorders>
+          </w:tcPr>
+          <w:p>
+            <w:pPr>
+              <w:spacing w:before="60" w:after="60"/>
+            </w:pPr>
+            <w:r>
+              <w:rPr>
+                <w:rFonts w:ascii="Open Sans" w:hAnsi="Open Sans"/>
+                <w:b w:val="0"/>
+                <w:i w:val="0"/>
+                <w:color w:val="1A1A2E"/>
+                <w:sz w:val="19"/>
+              </w:rPr>
+              <w:t>Monthly patch run — 28 endpoints all green, no manual intervention needed</w:t>
+            </w:r>
+          </w:p>
+        </w:tc>
+      </w:tr>
+      <w:tr>
+        <w:tc>
+          <w:tcPr>
+            <w:tcW w:type="dxa" w:w="2880"/>
+            <w:shd w:val="clear" w:color="auto" w:fill="F8F9FA"/>
+            <w:tcBorders>
+              <w:top w:val="single" w:sz="4" w:color="E9ECEF"/>
+              <w:left w:val="single" w:sz="4" w:color="E9ECEF"/>
+              <w:bottom w:val="single" w:sz="4" w:color="E9ECEF"/>
+              <w:right w:val="single" w:sz="4" w:color="E9ECEF"/>
+            </w:tcBorders>
+          </w:tcPr>
+          <w:p>
+            <w:pPr>
+              <w:spacing w:before="60" w:after="60"/>
+            </w:pPr>
+            <w:r>
+              <w:rPr>
+                <w:rFonts w:ascii="Open Sans" w:hAnsi="Open Sans"/>
+                <w:b/>
+                <w:i w:val="0"/>
+                <w:color w:val="F67D4B"/>
+                <w:sz w:val="19"/>
+              </w:rPr>
+              <w:t>Model title to justify 2.25h</w:t>
+            </w:r>
+          </w:p>
+        </w:tc>
+        <w:tc>
+          <w:tcPr>
+            <w:tcW w:type="dxa" w:w="6480"/>
+            <w:shd w:val="clear" w:color="auto" w:fill="FFFFFF"/>
+            <w:tcBorders>
+              <w:top w:val="single" w:sz="4" w:color="E9ECEF"/>
+              <w:left w:val="single" w:sz="4" w:color="E9ECEF"/>
+              <w:bottom w:val="single" w:sz="4" w:color="E9ECEF"/>
+              <w:right w:val="single" w:sz="4" w:color="E9ECEF"/>
+            </w:tcBorders>
+          </w:tcPr>
+          <w:p>
+            <w:pPr>
+              <w:spacing w:before="60" w:after="60"/>
+            </w:pPr>
+            <w:r>
+              <w:rPr>
+                <w:rFonts w:ascii="Open Sans" w:hAnsi="Open Sans"/>
+                <w:b w:val="0"/>
+                <w:i w:val="0"/>
+                <w:color w:val="1A1A2E"/>
+                <w:sz w:val="19"/>
+              </w:rPr>
+              <w:t>Patched 42 machines — 6 required manual WU service restart and reinstall of KB5034441; verified compliance in N-able dashboard before close (~2.5h)</w:t>
+            </w:r>
+          </w:p>
+        </w:tc>
+      </w:tr>
+    </w:tbl>
+    <w:p>
+      <w:pPr>
+        <w:spacing w:before="200" w:after="80"/>
+      </w:pPr>
+      <w:r>
+        <w:rPr>
+          <w:rFonts w:ascii="Open Sans" w:hAnsi="Open Sans"/>
+          <w:b/>
+          <w:i w:val="0"/>
+          <w:color w:val="006DB6"/>
+          <w:sz w:val="24"/>
+        </w:rPr>
+        <w:t>ORX ORX  —  2.25h logged</w:t>
+      </w:r>
+    </w:p>
+    <w:p>
+      <w:pPr>
+        <w:spacing w:after="80"/>
+      </w:pPr>
+      <w:r>
+        <w:rPr>
+          <w:rFonts w:ascii="Open Sans" w:hAnsi="Open Sans"/>
+          <w:b/>
+          <w:i w:val="0"/>
+          <w:color w:val="1A1A2E"/>
+          <w:sz w:val="20"/>
+        </w:rPr>
+        <w:t xml:space="preserve">You wrote:  </w:t>
+      </w:r>
+      <w:r>
+        <w:rPr>
+          <w:rFonts w:ascii="Open Sans" w:hAnsi="Open Sans"/>
+          <w:b w:val="0"/>
+          <w:i/>
+          <w:color w:val="59595B"/>
+          <w:sz w:val="20"/>
+        </w:rPr>
+        <w:t>“Device Non-Compliant Due to Missing Patches-  ORX-DC-3CX-01, ORX-DC-AD-03, ORX-DC-AD-04, ORX-DC-APP-01, ORX-DC-APP-04, O”</w:t>
+      </w:r>
+    </w:p>
+    <w:p>
+      <w:pPr>
+        <w:spacing w:after="80"/>
+      </w:pPr>
+      <w:r>
+        <w:rPr>
+          <w:rFonts w:ascii="Open Sans" w:hAnsi="Open Sans"/>
+          <w:b/>
+          <w:i w:val="0"/>
+          <w:color w:val="1A1A2E"/>
+          <w:sz w:val="20"/>
+        </w:rPr>
+        <w:t xml:space="preserve">Category: </w:t>
+      </w:r>
+      <w:r>
+        <w:rPr>
+          <w:rFonts w:ascii="Open Sans" w:hAnsi="Open Sans"/>
+          <w:b w:val="0"/>
+          <w:i w:val="0"/>
+          <w:color w:val="59595B"/>
+          <w:sz w:val="20"/>
+        </w:rPr>
+        <w:t xml:space="preserve">Routine: Patch management / Windows Update   </w:t>
+      </w:r>
+      <w:r>
+        <w:rPr>
+          <w:rFonts w:ascii="Open Sans" w:hAnsi="Open Sans"/>
+          <w:b/>
+          <w:i w:val="0"/>
+          <w:color w:val="1A1A2E"/>
+          <w:sz w:val="20"/>
+        </w:rPr>
+        <w:t xml:space="preserve">Expected: </w:t>
+      </w:r>
+      <w:r>
+        <w:rPr>
+          <w:rFonts w:ascii="Open Sans" w:hAnsi="Open Sans"/>
+          <w:b w:val="0"/>
+          <w:i w:val="0"/>
+          <w:color w:val="59595B"/>
+          <w:sz w:val="20"/>
+        </w:rPr>
+        <w:t>≤ 1.5 hours</w:t>
+      </w:r>
+    </w:p>
+    <w:p>
+      <w:pPr>
+        <w:spacing w:after="80"/>
+      </w:pPr>
+      <w:r>
+        <w:rPr>
+          <w:rFonts w:ascii="Open Sans" w:hAnsi="Open Sans"/>
+          <w:b/>
+          <w:i w:val="0"/>
+          <w:color w:val="1A1A2E"/>
+          <w:sz w:val="20"/>
+        </w:rPr>
+        <w:t xml:space="preserve">Why flagged: </w:t>
+      </w:r>
+      <w:r>
+        <w:rPr>
+          <w:rFonts w:ascii="Open Sans" w:hAnsi="Open Sans"/>
+          <w:b w:val="0"/>
+          <w:i w:val="0"/>
+          <w:color w:val="F67D4B"/>
+          <w:sz w:val="20"/>
+        </w:rPr>
+        <w:t>Your 2.25h is above the 1.5h normal cap for this category — title needs more detail.</w:t>
+      </w:r>
+    </w:p>
+    <w:p>
+      <w:pPr>
+        <w:spacing w:after="80"/>
+      </w:pPr>
+      <w:r>
+        <w:rPr>
+          <w:rFonts w:ascii="Open Sans" w:hAnsi="Open Sans"/>
+          <w:b/>
+          <w:i w:val="0"/>
+          <w:color w:val="1A1A2E"/>
+          <w:sz w:val="20"/>
+        </w:rPr>
+        <w:t xml:space="preserve">Title must include: </w:t>
+      </w:r>
+      <w:r>
+        <w:rPr>
+          <w:rFonts w:ascii="Open Sans" w:hAnsi="Open Sans"/>
+          <w:b w:val="0"/>
+          <w:i w:val="0"/>
+          <w:color w:val="59595B"/>
+          <w:sz w:val="20"/>
+        </w:rPr>
+        <w:t>machine count, which patches failed, manual reinstall steps</w:t>
+      </w:r>
+    </w:p>
+    <w:tbl>
+      <w:tblPr>
+        <w:tblW w:type="auto" w:w="0"/>
+        <w:tblLayout w:type="fixed"/>
+        <w:tblLook w:firstColumn="1" w:firstRow="1" w:lastColumn="0" w:lastRow="0" w:noHBand="0" w:noVBand="1" w:val="04A0"/>
+      </w:tblPr>
+      <w:tblGrid>
+        <w:gridCol w:w="4680"/>
+        <w:gridCol w:w="4680"/>
+      </w:tblGrid>
+      <w:tr>
+        <w:tc>
+          <w:tcPr>
+            <w:tcW w:type="dxa" w:w="2880"/>
+            <w:shd w:val="clear" w:color="auto" w:fill="F8F9FA"/>
+            <w:tcBorders>
+              <w:top w:val="single" w:sz="4" w:color="E9ECEF"/>
+              <w:left w:val="single" w:sz="4" w:color="E9ECEF"/>
+              <w:bottom w:val="single" w:sz="4" w:color="E9ECEF"/>
+              <w:right w:val="single" w:sz="4" w:color="E9ECEF"/>
+            </w:tcBorders>
+          </w:tcPr>
+          <w:p>
+            <w:pPr>
+              <w:spacing w:before="60" w:after="60"/>
+            </w:pPr>
+            <w:r>
+              <w:rPr>
+                <w:rFonts w:ascii="Open Sans" w:hAnsi="Open Sans"/>
+                <w:b/>
+                <w:i w:val="0"/>
+                <w:color w:val="1EAAC8"/>
+                <w:sz w:val="19"/>
+              </w:rPr>
+              <w:t>Model title within 1.5h</w:t>
+            </w:r>
+          </w:p>
+        </w:tc>
+        <w:tc>
+          <w:tcPr>
+            <w:tcW w:type="dxa" w:w="6480"/>
+            <w:shd w:val="clear" w:color="auto" w:fill="FFFFFF"/>
+            <w:tcBorders>
+              <w:top w:val="single" w:sz="4" w:color="E9ECEF"/>
+              <w:left w:val="single" w:sz="4" w:color="E9ECEF"/>
+              <w:bottom w:val="single" w:sz="4" w:color="E9ECEF"/>
+              <w:right w:val="single" w:sz="4" w:color="E9ECEF"/>
+            </w:tcBorders>
+          </w:tcPr>
+          <w:p>
+            <w:pPr>
+              <w:spacing w:before="60" w:after="60"/>
+            </w:pPr>
+            <w:r>
+              <w:rPr>
+                <w:rFonts w:ascii="Open Sans" w:hAnsi="Open Sans"/>
+                <w:b w:val="0"/>
+                <w:i w:val="0"/>
+                <w:color w:val="1A1A2E"/>
+                <w:sz w:val="19"/>
+              </w:rPr>
+              <w:t>Monthly patch run — 28 endpoints all green, no manual intervention needed</w:t>
+            </w:r>
+          </w:p>
+        </w:tc>
+      </w:tr>
+      <w:tr>
+        <w:tc>
+          <w:tcPr>
+            <w:tcW w:type="dxa" w:w="2880"/>
+            <w:shd w:val="clear" w:color="auto" w:fill="F8F9FA"/>
+            <w:tcBorders>
+              <w:top w:val="single" w:sz="4" w:color="E9ECEF"/>
+              <w:left w:val="single" w:sz="4" w:color="E9ECEF"/>
+              <w:bottom w:val="single" w:sz="4" w:color="E9ECEF"/>
+              <w:right w:val="single" w:sz="4" w:color="E9ECEF"/>
+            </w:tcBorders>
+          </w:tcPr>
+          <w:p>
+            <w:pPr>
+              <w:spacing w:before="60" w:after="60"/>
+            </w:pPr>
+            <w:r>
+              <w:rPr>
+                <w:rFonts w:ascii="Open Sans" w:hAnsi="Open Sans"/>
+                <w:b/>
+                <w:i w:val="0"/>
+                <w:color w:val="F67D4B"/>
+                <w:sz w:val="19"/>
+              </w:rPr>
+              <w:t>Model title to justify 2.25h</w:t>
+            </w:r>
+          </w:p>
+        </w:tc>
+        <w:tc>
+          <w:tcPr>
+            <w:tcW w:type="dxa" w:w="6480"/>
+            <w:shd w:val="clear" w:color="auto" w:fill="FFFFFF"/>
+            <w:tcBorders>
+              <w:top w:val="single" w:sz="4" w:color="E9ECEF"/>
+              <w:left w:val="single" w:sz="4" w:color="E9ECEF"/>
+              <w:bottom w:val="single" w:sz="4" w:color="E9ECEF"/>
+              <w:right w:val="single" w:sz="4" w:color="E9ECEF"/>
+            </w:tcBorders>
+          </w:tcPr>
+          <w:p>
+            <w:pPr>
+              <w:spacing w:before="60" w:after="60"/>
+            </w:pPr>
+            <w:r>
+              <w:rPr>
+                <w:rFonts w:ascii="Open Sans" w:hAnsi="Open Sans"/>
+                <w:b w:val="0"/>
+                <w:i w:val="0"/>
+                <w:color w:val="1A1A2E"/>
+                <w:sz w:val="19"/>
+              </w:rPr>
+              <w:t>Patched 42 machines — 6 required manual WU service restart and reinstall of KB5034441; verified compliance in N-able dashboard before close (~2.5h)</w:t>
+            </w:r>
+          </w:p>
+        </w:tc>
+      </w:tr>
+    </w:tbl>
+    <w:p>
+      <w:pPr>
+        <w:spacing w:before="200" w:after="80"/>
+      </w:pPr>
+      <w:r>
+        <w:rPr>
+          <w:rFonts w:ascii="Open Sans" w:hAnsi="Open Sans"/>
+          <w:b/>
+          <w:i w:val="0"/>
+          <w:color w:val="006DB6"/>
+          <w:sz w:val="24"/>
+        </w:rPr>
+        <w:t>VG VG  —  2.25h logged</w:t>
+      </w:r>
+    </w:p>
+    <w:p>
+      <w:pPr>
+        <w:spacing w:after="80"/>
+      </w:pPr>
+      <w:r>
+        <w:rPr>
+          <w:rFonts w:ascii="Open Sans" w:hAnsi="Open Sans"/>
+          <w:b/>
+          <w:i w:val="0"/>
+          <w:color w:val="1A1A2E"/>
+          <w:sz w:val="20"/>
+        </w:rPr>
+        <w:t xml:space="preserve">You wrote:  </w:t>
+      </w:r>
+      <w:r>
+        <w:rPr>
+          <w:rFonts w:ascii="Open Sans" w:hAnsi="Open Sans"/>
+          <w:b w:val="0"/>
+          <w:i/>
+          <w:color w:val="59595B"/>
+          <w:sz w:val="20"/>
+        </w:rPr>
+        <w:t>“Update 3cx version 20 to the latest release update.”</w:t>
+      </w:r>
+    </w:p>
+    <w:p>
+      <w:pPr>
+        <w:spacing w:after="80"/>
+      </w:pPr>
+      <w:r>
+        <w:rPr>
+          <w:rFonts w:ascii="Open Sans" w:hAnsi="Open Sans"/>
+          <w:b/>
+          <w:i w:val="0"/>
+          <w:color w:val="1A1A2E"/>
+          <w:sz w:val="20"/>
+        </w:rPr>
+        <w:t xml:space="preserve">Category: </w:t>
+      </w:r>
+      <w:r>
+        <w:rPr>
+          <w:rFonts w:ascii="Open Sans" w:hAnsi="Open Sans"/>
+          <w:b w:val="0"/>
+          <w:i w:val="0"/>
+          <w:color w:val="59595B"/>
+          <w:sz w:val="20"/>
+        </w:rPr>
+        <w:t xml:space="preserve">Routine: Phone / Voice / Teams   </w:t>
+      </w:r>
+      <w:r>
+        <w:rPr>
+          <w:rFonts w:ascii="Open Sans" w:hAnsi="Open Sans"/>
+          <w:b/>
+          <w:i w:val="0"/>
+          <w:color w:val="1A1A2E"/>
+          <w:sz w:val="20"/>
+        </w:rPr>
+        <w:t xml:space="preserve">Expected: </w:t>
+      </w:r>
+      <w:r>
+        <w:rPr>
+          <w:rFonts w:ascii="Open Sans" w:hAnsi="Open Sans"/>
+          <w:b w:val="0"/>
+          <w:i w:val="0"/>
+          <w:color w:val="59595B"/>
+          <w:sz w:val="20"/>
+        </w:rPr>
+        <w:t>≤ 1.5 hours</w:t>
+      </w:r>
+    </w:p>
+    <w:p>
+      <w:pPr>
+        <w:spacing w:after="80"/>
+      </w:pPr>
+      <w:r>
+        <w:rPr>
+          <w:rFonts w:ascii="Open Sans" w:hAnsi="Open Sans"/>
+          <w:b/>
+          <w:i w:val="0"/>
+          <w:color w:val="1A1A2E"/>
+          <w:sz w:val="20"/>
+        </w:rPr>
+        <w:t xml:space="preserve">Why flagged: </w:t>
+      </w:r>
+      <w:r>
+        <w:rPr>
+          <w:rFonts w:ascii="Open Sans" w:hAnsi="Open Sans"/>
+          <w:b w:val="0"/>
+          <w:i w:val="0"/>
+          <w:color w:val="F67D4B"/>
+          <w:sz w:val="20"/>
+        </w:rPr>
+        <w:t>Your 2.25h is above the 1.5h normal cap for this category — title needs more detail.</w:t>
+      </w:r>
+    </w:p>
+    <w:p>
+      <w:pPr>
+        <w:spacing w:after="80"/>
+      </w:pPr>
+      <w:r>
+        <w:rPr>
+          <w:rFonts w:ascii="Open Sans" w:hAnsi="Open Sans"/>
+          <w:b/>
+          <w:i w:val="0"/>
+          <w:color w:val="1A1A2E"/>
+          <w:sz w:val="20"/>
+        </w:rPr>
+        <w:t xml:space="preserve">Title must include: </w:t>
+      </w:r>
+      <w:r>
+        <w:rPr>
+          <w:rFonts w:ascii="Open Sans" w:hAnsi="Open Sans"/>
+          <w:b w:val="0"/>
+          <w:i w:val="0"/>
+          <w:color w:val="59595B"/>
+          <w:sz w:val="20"/>
+        </w:rPr>
+        <w:t>platform (RingCentral / Teams / 3CX), action (extension move, DID provision, license)</w:t>
+      </w:r>
+    </w:p>
+    <w:tbl>
+      <w:tblPr>
+        <w:tblW w:type="auto" w:w="0"/>
+        <w:tblLayout w:type="fixed"/>
+        <w:tblLook w:firstColumn="1" w:firstRow="1" w:lastColumn="0" w:lastRow="0" w:noHBand="0" w:noVBand="1" w:val="04A0"/>
+      </w:tblPr>
+      <w:tblGrid>
+        <w:gridCol w:w="4680"/>
+        <w:gridCol w:w="4680"/>
+      </w:tblGrid>
+      <w:tr>
+        <w:tc>
+          <w:tcPr>
+            <w:tcW w:type="dxa" w:w="2880"/>
+            <w:shd w:val="clear" w:color="auto" w:fill="F8F9FA"/>
+            <w:tcBorders>
+              <w:top w:val="single" w:sz="4" w:color="E9ECEF"/>
+              <w:left w:val="single" w:sz="4" w:color="E9ECEF"/>
+              <w:bottom w:val="single" w:sz="4" w:color="E9ECEF"/>
+              <w:right w:val="single" w:sz="4" w:color="E9ECEF"/>
+            </w:tcBorders>
+          </w:tcPr>
+          <w:p>
+            <w:pPr>
+              <w:spacing w:before="60" w:after="60"/>
+            </w:pPr>
+            <w:r>
+              <w:rPr>
+                <w:rFonts w:ascii="Open Sans" w:hAnsi="Open Sans"/>
+                <w:b/>
+                <w:i w:val="0"/>
+                <w:color w:val="1EAAC8"/>
+                <w:sz w:val="19"/>
+              </w:rPr>
+              <w:t>Model title within 1.5h</w:t>
+            </w:r>
+          </w:p>
+        </w:tc>
+        <w:tc>
+          <w:tcPr>
+            <w:tcW w:type="dxa" w:w="6480"/>
+            <w:shd w:val="clear" w:color="auto" w:fill="FFFFFF"/>
+            <w:tcBorders>
+              <w:top w:val="single" w:sz="4" w:color="E9ECEF"/>
+              <w:left w:val="single" w:sz="4" w:color="E9ECEF"/>
+              <w:bottom w:val="single" w:sz="4" w:color="E9ECEF"/>
+              <w:right w:val="single" w:sz="4" w:color="E9ECEF"/>
+            </w:tcBorders>
+          </w:tcPr>
+          <w:p>
+            <w:pPr>
+              <w:spacing w:before="60" w:after="60"/>
+            </w:pPr>
+            <w:r>
+              <w:rPr>
+                <w:rFonts w:ascii="Open Sans" w:hAnsi="Open Sans"/>
+                <w:b w:val="0"/>
+                <w:i w:val="0"/>
+                <w:color w:val="1A1A2E"/>
+                <w:sz w:val="19"/>
+              </w:rPr>
+              <w:t>RingCentral extension move for new hire, voicemail verified</w:t>
+            </w:r>
+          </w:p>
+        </w:tc>
+      </w:tr>
+      <w:tr>
+        <w:tc>
+          <w:tcPr>
+            <w:tcW w:type="dxa" w:w="2880"/>
+            <w:shd w:val="clear" w:color="auto" w:fill="F8F9FA"/>
+            <w:tcBorders>
+              <w:top w:val="single" w:sz="4" w:color="E9ECEF"/>
+              <w:left w:val="single" w:sz="4" w:color="E9ECEF"/>
+              <w:bottom w:val="single" w:sz="4" w:color="E9ECEF"/>
+              <w:right w:val="single" w:sz="4" w:color="E9ECEF"/>
+            </w:tcBorders>
+          </w:tcPr>
+          <w:p>
+            <w:pPr>
+              <w:spacing w:before="60" w:after="60"/>
+            </w:pPr>
+            <w:r>
+              <w:rPr>
+                <w:rFonts w:ascii="Open Sans" w:hAnsi="Open Sans"/>
+                <w:b/>
+                <w:i w:val="0"/>
+                <w:color w:val="F67D4B"/>
+                <w:sz w:val="19"/>
+              </w:rPr>
+              <w:t>Model title to justify 2.25h</w:t>
+            </w:r>
+          </w:p>
+        </w:tc>
+        <w:tc>
+          <w:tcPr>
+            <w:tcW w:type="dxa" w:w="6480"/>
+            <w:shd w:val="clear" w:color="auto" w:fill="FFFFFF"/>
+            <w:tcBorders>
+              <w:top w:val="single" w:sz="4" w:color="E9ECEF"/>
+              <w:left w:val="single" w:sz="4" w:color="E9ECEF"/>
+              <w:bottom w:val="single" w:sz="4" w:color="E9ECEF"/>
+              <w:right w:val="single" w:sz="4" w:color="E9ECEF"/>
+            </w:tcBorders>
+          </w:tcPr>
+          <w:p>
+            <w:pPr>
+              <w:spacing w:before="60" w:after="60"/>
+            </w:pPr>
+            <w:r>
+              <w:rPr>
+                <w:rFonts w:ascii="Open Sans" w:hAnsi="Open Sans"/>
+                <w:b w:val="0"/>
+                <w:i w:val="0"/>
+                <w:color w:val="1A1A2E"/>
+                <w:sz w:val="19"/>
+              </w:rPr>
+              <w:t>RingCentral migration for 3 users — re-provisioned extensions, ported DIDs, configured call queue, end-user training session (~3h)</w:t>
+            </w:r>
+          </w:p>
+        </w:tc>
+      </w:tr>
+    </w:tbl>
+    <w:p>
+      <w:pPr>
+        <w:spacing w:before="200" w:after="80"/>
+      </w:pPr>
+      <w:r>
+        <w:rPr>
+          <w:rFonts w:ascii="Open Sans" w:hAnsi="Open Sans"/>
+          <w:b/>
+          <w:i w:val="0"/>
+          <w:color w:val="006DB6"/>
+          <w:sz w:val="24"/>
+        </w:rPr>
+        <w:t>ORX ORX  —  2.25h logged</w:t>
+      </w:r>
+    </w:p>
+    <w:p>
+      <w:pPr>
+        <w:spacing w:after="80"/>
+      </w:pPr>
+      <w:r>
+        <w:rPr>
+          <w:rFonts w:ascii="Open Sans" w:hAnsi="Open Sans"/>
+          <w:b/>
+          <w:i w:val="0"/>
+          <w:color w:val="1A1A2E"/>
+          <w:sz w:val="20"/>
+        </w:rPr>
+        <w:t xml:space="preserve">You wrote:  </w:t>
+      </w:r>
+      <w:r>
+        <w:rPr>
+          <w:rFonts w:ascii="Open Sans" w:hAnsi="Open Sans"/>
+          <w:b w:val="0"/>
+          <w:i/>
+          <w:color w:val="59595B"/>
+          <w:sz w:val="20"/>
+        </w:rPr>
+        <w:t>“Device Non-Compliant Due to Missing Patches-  ORX-DC-3CX-01, ORX-DC-AD-03, ORX-DC-AD-04, ORX-DC-APP-01.”</w:t>
+      </w:r>
+    </w:p>
+    <w:p>
+      <w:pPr>
+        <w:spacing w:after="80"/>
+      </w:pPr>
+      <w:r>
+        <w:rPr>
+          <w:rFonts w:ascii="Open Sans" w:hAnsi="Open Sans"/>
+          <w:b/>
+          <w:i w:val="0"/>
+          <w:color w:val="1A1A2E"/>
+          <w:sz w:val="20"/>
+        </w:rPr>
+        <w:t xml:space="preserve">Category: </w:t>
+      </w:r>
+      <w:r>
+        <w:rPr>
+          <w:rFonts w:ascii="Open Sans" w:hAnsi="Open Sans"/>
+          <w:b w:val="0"/>
+          <w:i w:val="0"/>
+          <w:color w:val="59595B"/>
+          <w:sz w:val="20"/>
+        </w:rPr>
+        <w:t xml:space="preserve">Routine: Patch management / Windows Update   </w:t>
+      </w:r>
+      <w:r>
+        <w:rPr>
+          <w:rFonts w:ascii="Open Sans" w:hAnsi="Open Sans"/>
+          <w:b/>
+          <w:i w:val="0"/>
+          <w:color w:val="1A1A2E"/>
+          <w:sz w:val="20"/>
+        </w:rPr>
+        <w:t xml:space="preserve">Expected: </w:t>
+      </w:r>
+      <w:r>
+        <w:rPr>
+          <w:rFonts w:ascii="Open Sans" w:hAnsi="Open Sans"/>
+          <w:b w:val="0"/>
+          <w:i w:val="0"/>
+          <w:color w:val="59595B"/>
+          <w:sz w:val="20"/>
+        </w:rPr>
+        <w:t>≤ 1.5 hours</w:t>
+      </w:r>
+    </w:p>
+    <w:p>
+      <w:pPr>
+        <w:spacing w:after="80"/>
+      </w:pPr>
+      <w:r>
+        <w:rPr>
+          <w:rFonts w:ascii="Open Sans" w:hAnsi="Open Sans"/>
+          <w:b/>
+          <w:i w:val="0"/>
+          <w:color w:val="1A1A2E"/>
+          <w:sz w:val="20"/>
+        </w:rPr>
+        <w:t xml:space="preserve">Why flagged: </w:t>
+      </w:r>
+      <w:r>
+        <w:rPr>
+          <w:rFonts w:ascii="Open Sans" w:hAnsi="Open Sans"/>
+          <w:b w:val="0"/>
+          <w:i w:val="0"/>
+          <w:color w:val="F67D4B"/>
+          <w:sz w:val="20"/>
+        </w:rPr>
+        <w:t>Your 2.25h is above the 1.5h normal cap for this category — title needs more detail.</w:t>
+      </w:r>
+    </w:p>
+    <w:p>
+      <w:pPr>
+        <w:spacing w:after="80"/>
+      </w:pPr>
+      <w:r>
+        <w:rPr>
+          <w:rFonts w:ascii="Open Sans" w:hAnsi="Open Sans"/>
+          <w:b/>
+          <w:i w:val="0"/>
+          <w:color w:val="1A1A2E"/>
+          <w:sz w:val="20"/>
+        </w:rPr>
+        <w:t xml:space="preserve">Title must include: </w:t>
+      </w:r>
+      <w:r>
+        <w:rPr>
+          <w:rFonts w:ascii="Open Sans" w:hAnsi="Open Sans"/>
+          <w:b w:val="0"/>
+          <w:i w:val="0"/>
+          <w:color w:val="59595B"/>
+          <w:sz w:val="20"/>
+        </w:rPr>
+        <w:t>machine count, which patches failed, manual reinstall steps</w:t>
+      </w:r>
+    </w:p>
+    <w:tbl>
+      <w:tblPr>
+        <w:tblW w:type="auto" w:w="0"/>
+        <w:tblLayout w:type="fixed"/>
+        <w:tblLook w:firstColumn="1" w:firstRow="1" w:lastColumn="0" w:lastRow="0" w:noHBand="0" w:noVBand="1" w:val="04A0"/>
+      </w:tblPr>
+      <w:tblGrid>
+        <w:gridCol w:w="4680"/>
+        <w:gridCol w:w="4680"/>
+      </w:tblGrid>
+      <w:tr>
+        <w:tc>
+          <w:tcPr>
+            <w:tcW w:type="dxa" w:w="2880"/>
+            <w:shd w:val="clear" w:color="auto" w:fill="F8F9FA"/>
+            <w:tcBorders>
+              <w:top w:val="single" w:sz="4" w:color="E9ECEF"/>
+              <w:left w:val="single" w:sz="4" w:color="E9ECEF"/>
+              <w:bottom w:val="single" w:sz="4" w:color="E9ECEF"/>
+              <w:right w:val="single" w:sz="4" w:color="E9ECEF"/>
+            </w:tcBorders>
+          </w:tcPr>
+          <w:p>
+            <w:pPr>
+              <w:spacing w:before="60" w:after="60"/>
+            </w:pPr>
+            <w:r>
+              <w:rPr>
+                <w:rFonts w:ascii="Open Sans" w:hAnsi="Open Sans"/>
+                <w:b/>
+                <w:i w:val="0"/>
+                <w:color w:val="1EAAC8"/>
+                <w:sz w:val="19"/>
+              </w:rPr>
+              <w:t>Model title within 1.5h</w:t>
+            </w:r>
+          </w:p>
+        </w:tc>
+        <w:tc>
+          <w:tcPr>
+            <w:tcW w:type="dxa" w:w="6480"/>
+            <w:shd w:val="clear" w:color="auto" w:fill="FFFFFF"/>
+            <w:tcBorders>
+              <w:top w:val="single" w:sz="4" w:color="E9ECEF"/>
+              <w:left w:val="single" w:sz="4" w:color="E9ECEF"/>
+              <w:bottom w:val="single" w:sz="4" w:color="E9ECEF"/>
+              <w:right w:val="single" w:sz="4" w:color="E9ECEF"/>
+            </w:tcBorders>
+          </w:tcPr>
+          <w:p>
+            <w:pPr>
+              <w:spacing w:before="60" w:after="60"/>
+            </w:pPr>
+            <w:r>
+              <w:rPr>
+                <w:rFonts w:ascii="Open Sans" w:hAnsi="Open Sans"/>
+                <w:b w:val="0"/>
+                <w:i w:val="0"/>
+                <w:color w:val="1A1A2E"/>
+                <w:sz w:val="19"/>
+              </w:rPr>
+              <w:t>Monthly patch run — 28 endpoints all green, no manual intervention needed</w:t>
+            </w:r>
+          </w:p>
+        </w:tc>
+      </w:tr>
+      <w:tr>
+        <w:tc>
+          <w:tcPr>
+            <w:tcW w:type="dxa" w:w="2880"/>
+            <w:shd w:val="clear" w:color="auto" w:fill="F8F9FA"/>
+            <w:tcBorders>
+              <w:top w:val="single" w:sz="4" w:color="E9ECEF"/>
+              <w:left w:val="single" w:sz="4" w:color="E9ECEF"/>
+              <w:bottom w:val="single" w:sz="4" w:color="E9ECEF"/>
+              <w:right w:val="single" w:sz="4" w:color="E9ECEF"/>
+            </w:tcBorders>
+          </w:tcPr>
+          <w:p>
+            <w:pPr>
+              <w:spacing w:before="60" w:after="60"/>
+            </w:pPr>
+            <w:r>
+              <w:rPr>
+                <w:rFonts w:ascii="Open Sans" w:hAnsi="Open Sans"/>
+                <w:b/>
+                <w:i w:val="0"/>
+                <w:color w:val="F67D4B"/>
+                <w:sz w:val="19"/>
+              </w:rPr>
+              <w:t>Model title to justify 2.25h</w:t>
+            </w:r>
+          </w:p>
+        </w:tc>
+        <w:tc>
+          <w:tcPr>
+            <w:tcW w:type="dxa" w:w="6480"/>
+            <w:shd w:val="clear" w:color="auto" w:fill="FFFFFF"/>
+            <w:tcBorders>
+              <w:top w:val="single" w:sz="4" w:color="E9ECEF"/>
+              <w:left w:val="single" w:sz="4" w:color="E9ECEF"/>
+              <w:bottom w:val="single" w:sz="4" w:color="E9ECEF"/>
+              <w:right w:val="single" w:sz="4" w:color="E9ECEF"/>
+            </w:tcBorders>
+          </w:tcPr>
+          <w:p>
+            <w:pPr>
+              <w:spacing w:before="60" w:after="60"/>
+            </w:pPr>
+            <w:r>
+              <w:rPr>
+                <w:rFonts w:ascii="Open Sans" w:hAnsi="Open Sans"/>
+                <w:b w:val="0"/>
+                <w:i w:val="0"/>
+                <w:color w:val="1A1A2E"/>
+                <w:sz w:val="19"/>
+              </w:rPr>
+              <w:t>Patched 42 machines — 6 required manual WU service restart and reinstall of KB5034441; verified compliance in N-able dashboard before close (~2.5h)</w:t>
+            </w:r>
+          </w:p>
+        </w:tc>
+      </w:tr>
+    </w:tbl>
+    <w:p>
+      <w:r>
+        <w:br w:type="page"/>
+      </w:r>
+    </w:p>
+    <w:tbl>
+      <w:tblPr>
+        <w:tblW w:type="auto" w:w="0"/>
+        <w:tblLayout w:type="fixed"/>
+        <w:tblLook w:firstColumn="1" w:firstRow="1" w:lastColumn="0" w:lastRow="0" w:noHBand="0" w:noVBand="1" w:val="04A0"/>
+      </w:tblPr>
+      <w:tblGrid>
+        <w:gridCol w:w="94"/>
+        <w:gridCol w:w="8976"/>
+      </w:tblGrid>
+      <w:tr>
+        <w:tc>
+          <w:tcPr>
+            <w:tcW w:type="dxa" w:w="94"/>
+            <w:shd w:val="clear" w:color="auto" w:fill="F67D4B"/>
+            <w:tcBorders>
+              <w:top w:val="nil"/>
+              <w:left w:val="nil"/>
+              <w:bottom w:val="nil"/>
+              <w:right w:val="nil"/>
+              <w:insideH w:val="nil"/>
+              <w:insideV w:val="nil"/>
+            </w:tcBorders>
+          </w:tcPr>
+          <w:p/>
+        </w:tc>
+        <w:tc>
+          <w:tcPr>
+            <w:tcW w:type="dxa" w:w="8976"/>
+            <w:tcBorders>
+              <w:top w:val="nil"/>
+              <w:left w:val="nil"/>
+              <w:bottom w:val="nil"/>
+              <w:right w:val="nil"/>
+              <w:insideH w:val="nil"/>
+              <w:insideV w:val="nil"/>
+            </w:tcBorders>
+          </w:tcPr>
+          <w:p>
+            <w:pPr>
+              <w:spacing w:before="80" w:after="80"/>
+            </w:pPr>
+            <w:r>
+              <w:rPr>
+                <w:rFonts w:ascii="Open Sans" w:hAnsi="Open Sans"/>
+                <w:b/>
+                <w:i w:val="0"/>
+                <w:color w:val="F67D4B"/>
+                <w:sz w:val="28"/>
+              </w:rPr>
               <w:t xml:space="preserve">  Personalized Training Focus</w:t>
             </w:r>
           </w:p>

</xml_diff>